<commit_message>
Reorganize repo, move .gitignore to root, add module2 activity files
</commit_message>
<xml_diff>
--- a/course notes.docx
+++ b/course notes.docx
@@ -16,7 +16,7 @@
         <w:rPr>
           <w:noProof/>
         </w:rPr>
-        <w:t>2/4/2026</w:t>
+        <w:t>2/9/2026</w:t>
       </w:r>
       <w:r>
         <w:fldChar w:fldCharType="end"/>
@@ -32,7 +32,23 @@
     </w:p>
     <w:p>
       <w:r>
-        <w:t>Rest API siting there and listening to clients requests for data from another computer,</w:t>
+        <w:t xml:space="preserve">Rest API </w:t>
+      </w:r>
+      <w:proofErr w:type="gramStart"/>
+      <w:r>
+        <w:t>siting</w:t>
+      </w:r>
+      <w:proofErr w:type="gramEnd"/>
+      <w:r>
+        <w:t xml:space="preserve"> there and listening to </w:t>
+      </w:r>
+      <w:proofErr w:type="gramStart"/>
+      <w:r>
+        <w:t>clients</w:t>
+      </w:r>
+      <w:proofErr w:type="gramEnd"/>
+      <w:r>
+        <w:t xml:space="preserve"> requests for data from another computer,</w:t>
       </w:r>
     </w:p>
     <w:p>
@@ -57,7 +73,15 @@
         <w:t xml:space="preserve">http: hypertext </w:t>
       </w:r>
       <w:r>
-        <w:t xml:space="preserve">transfer protocol, is how web browser talk to </w:t>
+        <w:t xml:space="preserve">transfer protocol, is how web browser </w:t>
+      </w:r>
+      <w:proofErr w:type="gramStart"/>
+      <w:r>
+        <w:t>talk</w:t>
+      </w:r>
+      <w:proofErr w:type="gramEnd"/>
+      <w:r>
+        <w:t xml:space="preserve"> to </w:t>
       </w:r>
       <w:r>
         <w:t>web server</w:t>
@@ -72,8 +96,13 @@
         </w:numPr>
       </w:pPr>
       <w:r>
-        <w:t>key components: url</w:t>
-      </w:r>
+        <w:t xml:space="preserve">key components: </w:t>
+      </w:r>
+      <w:proofErr w:type="spellStart"/>
+      <w:r>
+        <w:t>url</w:t>
+      </w:r>
+      <w:proofErr w:type="spellEnd"/>
       <w:r>
         <w:t xml:space="preserve">, </w:t>
       </w:r>
@@ -102,8 +131,13 @@
         <w:t xml:space="preserve">.in and create API key and then open cursor </w:t>
       </w:r>
       <w:r>
-        <w:t>click new file create .env</w:t>
-      </w:r>
+        <w:t xml:space="preserve">click new file </w:t>
+      </w:r>
+      <w:proofErr w:type="gramStart"/>
+      <w:r>
+        <w:t>create .env</w:t>
+      </w:r>
+      <w:proofErr w:type="gramEnd"/>
     </w:p>
     <w:p>
       <w:r>
@@ -119,7 +153,7 @@
         <w:rPr>
           <w:noProof/>
         </w:rPr>
-        <w:t>2/4/2026</w:t>
+        <w:t>2/9/2026</w:t>
       </w:r>
       <w:r>
         <w:fldChar w:fldCharType="end"/>
@@ -158,8 +192,21 @@
           <w:numId w:val="1"/>
         </w:numPr>
       </w:pPr>
-      <w:r>
-        <w:t>Copilot stay excl</w:t>
+      <w:proofErr w:type="gramStart"/>
+      <w:r>
+        <w:t>Copilot</w:t>
+      </w:r>
+      <w:proofErr w:type="gramEnd"/>
+      <w:r>
+        <w:t xml:space="preserve"> </w:t>
+      </w:r>
+      <w:proofErr w:type="gramStart"/>
+      <w:r>
+        <w:t>stay</w:t>
+      </w:r>
+      <w:proofErr w:type="gramEnd"/>
+      <w:r>
+        <w:t xml:space="preserve"> excl</w:t>
       </w:r>
       <w:r>
         <w:t>usively on your computer</w:t>
@@ -174,11 +221,24 @@
         </w:numPr>
       </w:pPr>
       <w:r>
-        <w:t xml:space="preserve">Ai take two prompts: 1. </w:t>
-      </w:r>
-      <w:r>
-        <w:t>User; 2 system context</w:t>
-      </w:r>
+        <w:t xml:space="preserve">Ai </w:t>
+      </w:r>
+      <w:proofErr w:type="gramStart"/>
+      <w:r>
+        <w:t>take</w:t>
+      </w:r>
+      <w:proofErr w:type="gramEnd"/>
+      <w:r>
+        <w:t xml:space="preserve"> two prompts: 1. </w:t>
+      </w:r>
+      <w:r>
+        <w:t xml:space="preserve">User; 2 system </w:t>
+      </w:r>
+      <w:proofErr w:type="gramStart"/>
+      <w:r>
+        <w:t>context</w:t>
+      </w:r>
+      <w:proofErr w:type="gramEnd"/>
     </w:p>
     <w:p>
       <w:pPr>
@@ -204,7 +264,15 @@
         </w:numPr>
       </w:pPr>
       <w:r>
-        <w:t xml:space="preserve">Any files or folders that start with . something </w:t>
+        <w:t xml:space="preserve">Any files or folders that start </w:t>
+      </w:r>
+      <w:proofErr w:type="gramStart"/>
+      <w:r>
+        <w:t>with .</w:t>
+      </w:r>
+      <w:proofErr w:type="gramEnd"/>
+      <w:r>
+        <w:t xml:space="preserve"> something </w:t>
       </w:r>
       <w:r>
         <w:t>you can ignore, as those are not important</w:t>

</xml_diff>

<commit_message>
Lab 3: Add AI-powered methane emissions reporter with interactive HTML report
</commit_message>
<xml_diff>
--- a/course notes.docx
+++ b/course notes.docx
@@ -16,7 +16,7 @@
         <w:rPr>
           <w:noProof/>
         </w:rPr>
-        <w:t>2/9/2026</w:t>
+        <w:t>2/11/2026</w:t>
       </w:r>
       <w:r>
         <w:fldChar w:fldCharType="end"/>
@@ -153,7 +153,7 @@
         <w:rPr>
           <w:noProof/>
         </w:rPr>
-        <w:t>2/9/2026</w:t>
+        <w:t>2/11/2026</w:t>
       </w:r>
       <w:r>
         <w:fldChar w:fldCharType="end"/>
@@ -290,6 +290,27 @@
         <w:t xml:space="preserve"> </w:t>
       </w:r>
     </w:p>
+    <w:p>
+      <w:r>
+        <w:fldChar w:fldCharType="begin"/>
+      </w:r>
+      <w:r>
+        <w:instrText xml:space="preserve"> DATE \@ "M/d/yyyy" </w:instrText>
+      </w:r>
+      <w:r>
+        <w:fldChar w:fldCharType="separate"/>
+      </w:r>
+      <w:r>
+        <w:rPr>
+          <w:noProof/>
+        </w:rPr>
+        <w:t>2/11/2026</w:t>
+      </w:r>
+      <w:r>
+        <w:fldChar w:fldCharType="end"/>
+      </w:r>
+    </w:p>
+    <w:p/>
     <w:sectPr>
       <w:pgSz w:w="12240" w:h="15840"/>
       <w:pgMar w:top="1440" w:right="1440" w:bottom="1440" w:left="1440" w:header="720" w:footer="720" w:gutter="0"/>

</xml_diff>